<commit_message>
Tighten Cornell SOP and PS to emphasize strengths and quantified results
Co-Authored-By: Claude Sonnet 5.5 <noreply@anthropic.com>
Claude-Session: https://claude.ai/code/session_016jK7nG2piZZaD8aY8Qq4ov
</commit_message>
<xml_diff>
--- a/Cornell_MSBA/Cornell_MSBA_SOP_and_PS.docx
+++ b/Cornell_MSBA/Cornell_MSBA_SOP_and_PS.docx
@@ -25,7 +25,7 @@
         <w:pStyle w:val="FirstParagraph"/>
       </w:pPr>
       <w:r>
-        <w:t xml:space="preserve">At Korean Air, an empty seat lost its value the moment an aircraft departed. At Samsung SDS, freight moved through a network of bookings, consolidations, and transport legs. In both settings I met the same question: how should an organization allocate limited capacity when demand keeps changing? My academic interests center on it, specifically on demand forecasting, optimization, and causal inference applied to capacity and inventory decisions in supply chains.</w:t>
+        <w:t xml:space="preserve">At Korean Air, an empty seat lost its value the moment an aircraft departed. At Samsung SDS, freight moved through a network of bookings, consolidations, and transport legs. In both settings I faced the same question: how should an organization allocate limited capacity when demand keeps changing? My academic interests center on it, specifically on demand forecasting, optimization, and causal inference applied to capacity and inventory decisions in supply chains.</w:t>
       </w:r>
     </w:p>
     <w:p>
@@ -33,7 +33,7 @@
         <w:pStyle w:val="BodyText"/>
       </w:pPr>
       <w:r>
-        <w:t xml:space="preserve">My preparation is practical and quantitative. I earned a finance degree at the University of Wisconsin-Madison, where I completed calculus and statistics coursework with strong grades, and studied on exchange at the National University of Singapore. Over eleven years at Korean Air, I worked in revenue management and sales analytics, operating forecasting and pricing systems, applying logistic regression and random forests in Python to analyze route-level recovery during COVID-19, and leading a seven-person team across Manila, Cebu, and Guam. At Samsung SDS, I led a six-person task force that standardized freight volume reporting across six regions and ten organizations, using SQL to separate reporting-month shifts from genuine errors and restoring 28,306 forty-foot equivalent units of misclassified 2025 volume. Alongside full-time work, I earned CPIM and PMP certifications and completed coursework in linear algebra for machine learning.</w:t>
+        <w:t xml:space="preserve">I approach this question with thirteen years of operating experience and a quantitative foundation from a finance degree at the University of Wisconsin-Madison and an exchange at the National University of Singapore. At Korean Air, I built a reservation misuse monitoring tool in SQL that flagged more than 600 cases annually and helped prevent an estimated $370,000 in revenue leakage. I applied logistic regression and random forests in Python to analyze route-level recovery during COVID-19, and led a seven-person team across Manila, Cebu, and Guam.</w:t>
       </w:r>
     </w:p>
     <w:p>
@@ -41,7 +41,7 @@
         <w:pStyle w:val="BodyText"/>
       </w:pPr>
       <w:r>
-        <w:t xml:space="preserve">These experiences taught me to understand how data are produced before interpreting them. At Samsung SDS, reliable reporting told us what had moved, but not where demand would grow or whether a capacity decision would improve service. I can apply models, yet I lack a rigorous foundation for choosing among methods, validating them, and stating how much confidence a prediction deserves. Sustained study with faculty feedback is the step I cannot take on my own.</w:t>
+        <w:t xml:space="preserve">At Samsung SDS, I led a six-person task force to resolve freight volume discrepancies of up to 25% between branches and headquarters across six regions and ten organizations. By separating reporting-month shifts from genuine errors, we restored 28,306 forty-foot equivalent units of misclassified 2025 volume, and fixing input requirements at the source reduced the anomalous record rate from 0.80% to 0.56%. Outside work, I earned CPIM and PMP certifications and built and sold a consumer product, AiMollaeBook, now past 2,000 units.</w:t>
       </w:r>
     </w:p>
     <w:p>
@@ -49,7 +49,7 @@
         <w:pStyle w:val="BodyText"/>
       </w:pPr>
       <w:r>
-        <w:t xml:space="preserve">Cornell’s MSBA is the right place to take that step. The Operations and Supply Chain Analytics concentration speaks directly to my goal, and the program’s emphasis on applying statistical, mathematical, and computational techniques to real problems and real data matches how supply chain decisions arise: a forecast matters only in light of the resources committed in response. I am equally drawn to its focus on machine learning and predictive modeling, which would give me the validation discipline I lack, and on ethics and data governance, which I want to apply to AI-assisted analysis. Its cross-functional, project-based teamwork would let me contribute operational context from aviation and logistics while having my reasoning challenged by classmates from finance and marketing.</w:t>
+        <w:t xml:space="preserve">These experiences taught me to understand how data are produced before interpreting them. They also showed me what I still need. Reliable reporting told us what had moved, but not where demand would grow or whether a capacity decision would improve service. I can apply models, yet I lack a rigorous foundation for choosing among them, validating them, and stating how much confidence a prediction deserves. That foundation is what I seek from graduate study.</w:t>
       </w:r>
     </w:p>
     <w:p>
@@ -57,7 +57,15 @@
         <w:pStyle w:val="BodyText"/>
       </w:pPr>
       <w:r>
-        <w:t xml:space="preserve">After graduating, I intend to join a U.S. supply chain or logistics analytics team focused on demand forecasting and capacity allocation, taking ownership of defined problems from analysis through implementation. In the longer term, I aspire to lead an analytics team as an orchestrator who connects domain expertise, people, data, and AI, helping organizations decide which problems to solve and how much evidence a decision requires.</w:t>
+        <w:t xml:space="preserve">Cornell’s MSBA is the right place to build it. The Operations and Supply Chain Analytics concentration speaks directly to my goal, and the program’s emphasis on applying statistical and computational techniques to real problems and real data matches how supply chain decisions arise: a forecast matters only in light of the resources committed in response. Its focus on machine learning and predictive modeling would give me the validation discipline I need.. In project teams, I would contribute operational context from aviation and logistics while having my reasoning challenged by classmates from finance and marketing.</w:t>
+      </w:r>
+    </w:p>
+    <w:p>
+      <w:pPr>
+        <w:pStyle w:val="BodyText"/>
+      </w:pPr>
+      <w:r>
+        <w:t xml:space="preserve">After graduating, I intend to join a U.S. supply chain or logistics analytics team focused on demand forecasting and capacity allocation, taking ownership of problems from analysis through implementation. In the longer term, I aspire to lead an analytics team as an orchestrator who connects domain expertise, people, data, and AI, helping organizations decide which problems to solve and how much evidence a decision requires.</w:t>
       </w:r>
     </w:p>
     <w:bookmarkEnd w:id="20"/>
@@ -75,7 +83,7 @@
         <w:pStyle w:val="FirstParagraph"/>
       </w:pPr>
       <w:r>
-        <w:t xml:space="preserve">My path to graduate study has involved repeatedly being a newcomer. I grew up in Korea, studied finance at the University of Wisconsin-Madison, and spent a semester at the National University of Singapore. Each move taught me that competence in one setting does not transfer automatically. I had to learn how people around me reasoned, what they took for granted, and what they were reluctant to say aloud.</w:t>
+        <w:t xml:space="preserve">My path to graduate study has repeatedly made me a newcomer. I grew up in Korea, studied finance at the University of Wisconsin-Madison, and spent a semester at the National University of Singapore. Each move taught me that competence in one setting does not transfer automatically; I had to learn how people around me reasoned and what they took for granted.</w:t>
       </w:r>
     </w:p>
     <w:p>
@@ -83,7 +91,7 @@
         <w:pStyle w:val="BodyText"/>
       </w:pPr>
       <w:r>
-        <w:t xml:space="preserve">That lesson shaped my career. After eleven years at Korean Air, I led a team of seven across Manila, Cebu, and Guam during the post-COVID recovery. Headquarters and local agencies read the same market differently, and early on I mistook those differences for resistance. Visiting the field changed my view: the agencies held knowledge that headquarters’ reports could not capture. Revised reporting procedures made it easier for that knowledge to reach decisions, and group reservations rose 340% year over year during the recovery period. I came to see my role as creating space for the people closest to a problem to be heard.</w:t>
+        <w:t xml:space="preserve">That lesson shaped my career. After years at Korean Air, I led a team of seven across Manila, Cebu, and Guam during the post-COVID recovery. Headquarters and local agencies read the same market differently, and early on I mistook those differences for resistance. Field visits changed my view: the agencies held knowledge that headquarters’ reports could not capture. I revised reporting procedures so that knowledge could reach decisions, and group reservations rose 340% year over year. I came to see my role as creating space for the people closest to a problem to be heard.</w:t>
       </w:r>
     </w:p>
     <w:p>
@@ -91,7 +99,7 @@
         <w:pStyle w:val="BodyText"/>
       </w:pPr>
       <w:r>
-        <w:t xml:space="preserve">In 2024, I left aviation for Samsung SDS and became a beginner again, in a field whose vocabulary I did not yet speak. After years of being the person colleagues turned to for answers, I had to ask questions that once felt too basic. When colleagues explained why they measured shipments differently, I learned to withhold judgment until I understood their process. That habit later helped me lead a six-person task force through a reporting dispute involving ten organizations, because we first established what each rule was meant to measure before deciding which was wrong.</w:t>
+        <w:t xml:space="preserve">In 2024, I left aviation for Samsung SDS and became a beginner again. After years of being the person colleagues turned to for answers, I had to ask questions that once felt too basic. When colleagues explained why they measured shipments differently, I learned to withhold judgment until I understood their process. That habit let me lead a six-person task force through a reporting dispute across ten organizations: we first established what each rule was meant to measure before deciding which was wrong, and the shared definitions we agreed on are now how those regions explain their figures.</w:t>
       </w:r>
     </w:p>
     <w:p>
@@ -99,7 +107,7 @@
         <w:pStyle w:val="BodyText"/>
       </w:pPr>
       <w:r>
-        <w:t xml:space="preserve">Becoming a parent added another perspective. Raising two children led me to design and sell AiMollaeBook, a book-shaped product that keeps a phone out of sight. More than 2,000 units have sold. It demanded skills I did not have, and I relied on advice from people with far more experience than I had. Doing it while working full time showed me both the cost and the value of pursuing a goal on a demanding schedule.</w:t>
+        <w:t xml:space="preserve">Becoming a parent added another perspective. Raising two children led me to design and sell AiMollaeBook, a book-shaped product that keeps a phone out of sight. I had no experience in production, marketing, or fulfillment, so I learned each from people who knew more than I did. More than 2,000 units later, I know that I can pick up an unfamiliar discipline quickly and take responsibility for the result.</w:t>
       </w:r>
     </w:p>
     <w:p>
@@ -107,7 +115,7 @@
         <w:pStyle w:val="BodyText"/>
       </w:pPr>
       <w:r>
-        <w:t xml:space="preserve">These experiences are why I am pursuing a graduate degree now, and why I believe I can succeed in it. I have learned to study seriously alongside full-time work, earning CPIM and PMP certifications. I also know that I learn most from people whose backgrounds differ from mine.</w:t>
+        <w:t xml:space="preserve">These experiences are why I am pursuing a graduate degree now, and why I expect to succeed in it. I have kept up serious study alongside full-time work, earning CPIM and PMP certifications, and I know I learn most from people whose backgrounds differ from mine.</w:t>
       </w:r>
     </w:p>
     <w:p>
@@ -115,7 +123,7 @@
         <w:pStyle w:val="BodyText"/>
       </w:pPr>
       <w:r>
-        <w:t xml:space="preserve">At Cornell, I would contribute as someone who has worked across cultures and industries, who listens before judging, and who welcomes questions about his own assumptions. I want classmates to feel free to say what they do not yet understand, because I have benefited from that freedom myself.</w:t>
+        <w:t xml:space="preserve">At Cornell, I would contribute as someone who has worked across cultures and industries, who listens before judging, and who welcomes questions about my own assumptions. I want classmates to feel free to say what they do not yet understand, because I have benefited from that freedom myself.</w:t>
       </w:r>
     </w:p>
     <w:bookmarkEnd w:id="21"/>

</xml_diff>

<commit_message>
Rewrite Cornell personal statement as a narrative around learning from others
Co-Authored-By: Claude Sonnet 5.5 <noreply@anthropic.com>
Claude-Session: https://claude.ai/code/session_016jK7nG2piZZaD8aY8Qq4ov
</commit_message>
<xml_diff>
--- a/Cornell_MSBA/Cornell_MSBA_SOP_and_PS.docx
+++ b/Cornell_MSBA/Cornell_MSBA_SOP_and_PS.docx
@@ -83,7 +83,7 @@
         <w:pStyle w:val="FirstParagraph"/>
       </w:pPr>
       <w:r>
-        <w:t xml:space="preserve">My path to graduate study has repeatedly made me a newcomer. I grew up in Korea, studied finance at the University of Wisconsin-Madison, and spent a semester at the National University of Singapore. Each move taught me that competence in one setting does not transfer automatically; I had to learn how people around me reasoned and what they took for granted.</w:t>
+        <w:t xml:space="preserve">For most of my career, I was the person colleagues came to for answers. It took leading people in places I did not understand to see how limited that role was.</w:t>
       </w:r>
     </w:p>
     <w:p>
@@ -91,7 +91,7 @@
         <w:pStyle w:val="BodyText"/>
       </w:pPr>
       <w:r>
-        <w:t xml:space="preserve">That lesson shaped my career. After years at Korean Air, I led a team of seven across Manila, Cebu, and Guam during the post-COVID recovery. Headquarters and local agencies read the same market differently, and early on I mistook those differences for resistance. Field visits changed my view: the agencies held knowledge that headquarters’ reports could not capture. I revised reporting procedures so that knowledge could reach decisions, and group reservations rose 340% year over year. I came to see my role as creating space for the people closest to a problem to be heard.</w:t>
+        <w:t xml:space="preserve">In 2022, I began leading a team of seven in Manila, Cebu, and Guam while travel was recovering from COVID-19. Our headquarters in Seoul and the local agencies kept reading the same market differently, and I assumed the agencies were being resistant. Then I visited them. The agents knew which customers were returning, which groups were forming, and why, and none of it appeared in the reports I had been reading from Seoul. I rewrote our reporting so their knowledge could reach the people making decisions. Group reservations rose 340% that year, but what stayed with me was simpler: the people closest to a problem usually understand it best, and my job was to make sure they were heard.</w:t>
       </w:r>
     </w:p>
     <w:p>
@@ -99,7 +99,7 @@
         <w:pStyle w:val="BodyText"/>
       </w:pPr>
       <w:r>
-        <w:t xml:space="preserve">In 2024, I left aviation for Samsung SDS and became a beginner again. After years of being the person colleagues turned to for answers, I had to ask questions that once felt too basic. When colleagues explained why they measured shipments differently, I learned to withhold judgment until I understood their process. That habit let me lead a six-person task force through a reporting dispute across ten organizations: we first established what each rule was meant to measure before deciding which was wrong, and the shared definitions we agreed on are now how those regions explain their figures.</w:t>
+        <w:t xml:space="preserve">Two years later, I left aviation for Samsung SDS and had to learn the same lesson again from the other side. I was suddenly the newcomer, asking questions that would once have embarrassed me. When a freight reporting dispute spread across ten organizations, those questions mattered. Each department’s rules made sense for its own operations, and I could not tell which were wrong until I understood what each was meant to measure. Listening first is what allowed a six-person task force to agree on shared definitions that those regions still use.</w:t>
       </w:r>
     </w:p>
     <w:p>
@@ -107,7 +107,7 @@
         <w:pStyle w:val="BodyText"/>
       </w:pPr>
       <w:r>
-        <w:t xml:space="preserve">Becoming a parent added another perspective. Raising two children led me to design and sell AiMollaeBook, a book-shaped product that keeps a phone out of sight. I had no experience in production, marketing, or fulfillment, so I learned each from people who knew more than I did. More than 2,000 units later, I know that I can pick up an unfamiliar discipline quickly and take responsibility for the result.</w:t>
+        <w:t xml:space="preserve">The same pattern appeared at home. As a parent, I wanted to solve a small daily problem, keeping phones out of my children’s sight, and ended up designing and selling a product, AiMollaeBook. I knew nothing about manufacturing or fulfillment, so I asked people who did. Every answer I received made the next decision easier.</w:t>
       </w:r>
     </w:p>
     <w:p>
@@ -115,7 +115,7 @@
         <w:pStyle w:val="BodyText"/>
       </w:pPr>
       <w:r>
-        <w:t xml:space="preserve">These experiences are why I am pursuing a graduate degree now, and why I expect to succeed in it. I have kept up serious study alongside full-time work, earning CPIM and PMP certifications, and I know I learn most from people whose backgrounds differ from mine.</w:t>
+        <w:t xml:space="preserve">I now want to pursue a graduate degree because I have reached the limit of what I can learn on the job. I can ask good questions and make careful use of data, but I need rigorous training in forecasting and optimization, and peers who will challenge how I reason. I have already shown I can study seriously alongside full-time work, earning CPIM and PMP certifications.</w:t>
       </w:r>
     </w:p>
     <w:p>
@@ -123,7 +123,7 @@
         <w:pStyle w:val="BodyText"/>
       </w:pPr>
       <w:r>
-        <w:t xml:space="preserve">At Cornell, I would contribute as someone who has worked across cultures and industries, who listens before judging, and who welcomes questions about my own assumptions. I want classmates to feel free to say what they do not yet understand, because I have benefited from that freedom myself.</w:t>
+        <w:t xml:space="preserve">At Cornell, I would bring the habits these experiences built: asking the basic question when others hesitate, listening before judging, and making room for classmates whose training or background differs from mine. I have learned that the best work happens in teams where no one is afraid to say what they do not yet understand, and I want to help create that environment.</w:t>
       </w:r>
     </w:p>
     <w:bookmarkEnd w:id="21"/>

</xml_diff>

<commit_message>
Rewrite Cornell personal statement around GSO translator role and knowledge-gap motivation
Co-Authored-By: Claude Sonnet 5.5 <noreply@anthropic.com>
Claude-Session: https://claude.ai/code/session_016jK7nG2piZZaD8aY8Qq4ov
</commit_message>
<xml_diff>
--- a/Cornell_MSBA/Cornell_MSBA_SOP_and_PS.docx
+++ b/Cornell_MSBA/Cornell_MSBA_SOP_and_PS.docx
@@ -83,7 +83,7 @@
         <w:pStyle w:val="FirstParagraph"/>
       </w:pPr>
       <w:r>
-        <w:t xml:space="preserve">For most of my career, I was the person colleagues came to for answers. It took leading people in places I did not understand to see how limited that role was.</w:t>
+        <w:t xml:space="preserve">After thirteen years of work, what pushed me toward graduate study was not a lack of experience but the limits of what experience alone could teach me. I could build tools and run analyses, yet I kept reaching questions I could not answer well: why one method suits a problem, how far to trust a forecast, what evidence justifies a decision. I realized that I needed two things I could not get on the job: the theory behind the methods I use, and fresh conversations with peers who do not share my assumptions.</w:t>
       </w:r>
     </w:p>
     <w:p>
@@ -91,7 +91,7 @@
         <w:pStyle w:val="BodyText"/>
       </w:pPr>
       <w:r>
-        <w:t xml:space="preserve">In 2022, I began leading a team of seven in Manila, Cebu, and Guam while travel was recovering from COVID-19. Our headquarters in Seoul and the local agencies kept reading the same market differently, and I assumed the agencies were being resistant. Then I visited them. The agents knew which customers were returning, which groups were forming, and why, and none of it appeared in the reports I had been reading from Seoul. I rewrote our reporting so their knowledge could reach the people making decisions. Group reservations rose 340% that year, but what stayed with me was simpler: the people closest to a problem usually understand it best, and my job was to make sure they were heard.</w:t>
+        <w:t xml:space="preserve">The role that taught me the most about working across differences was the 17-month Group Sales Optimizer project at Korean Air, where I translated sales rules into automated booking workflows. The people involved spoke different professional languages. Sales staff knew pricing and customers but little about systems, IT engineers knew systems but not how group sales works, and external vendors had their own constraints and vocabulary. I became the translator. For sales colleagues, I described requirements in terms of customers and revenue. For engineers, I expressed the same needs as precise logic and data. For vendors, I framed requests in terms of their situation and terminology. No one needed to learn another’s field; they needed someone willing to meet them where they were. The project worked because everyone could take part on terms they understood.</w:t>
       </w:r>
     </w:p>
     <w:p>
@@ -99,7 +99,7 @@
         <w:pStyle w:val="BodyText"/>
       </w:pPr>
       <w:r>
-        <w:t xml:space="preserve">Two years later, I left aviation for Samsung SDS and had to learn the same lesson again from the other side. I was suddenly the newcomer, asking questions that would once have embarrassed me. When a freight reporting dispute spread across ten organizations, those questions mattered. Each department’s rules made sense for its own operations, and I could not tell which were wrong until I understood what each was meant to measure. Listening first is what allowed a six-person task force to agree on shared definitions that those regions still use.</w:t>
+        <w:t xml:space="preserve">I learned the same lesson leading a team of seven in Manila, Cebu, and Guam, where headquarters and local agencies read the market differently. Field visits showed me that local colleagues held knowledge that our reports lacked, and revising our reporting so their voices reached decisions helped group reservations rise 340% year over year. When I joined Samsung SDS in 2024, I became the newcomer, asking questions that once felt too basic. That openness helped a six-person task force settle a reporting dispute across ten organizations by first agreeing on what each rule was meant to measure.</w:t>
       </w:r>
     </w:p>
     <w:p>
@@ -107,7 +107,7 @@
         <w:pStyle w:val="BodyText"/>
       </w:pPr>
       <w:r>
-        <w:t xml:space="preserve">The same pattern appeared at home. As a parent, I wanted to solve a small daily problem, keeping phones out of my children’s sight, and ended up designing and selling a product, AiMollaeBook. I knew nothing about manufacturing or fulfillment, so I asked people who did. Every answer I received made the next decision easier.</w:t>
+        <w:t xml:space="preserve">I have also shown I can sustain demanding study. I earned CPIM and PMP certifications while working full time, and, as a parent, I taught myself production and fulfillment to build a product, AiMollaeBook, now past 2,000 units.</w:t>
       </w:r>
     </w:p>
     <w:p>
@@ -115,15 +115,7 @@
         <w:pStyle w:val="BodyText"/>
       </w:pPr>
       <w:r>
-        <w:t xml:space="preserve">I now want to pursue a graduate degree because I have reached the limit of what I can learn on the job. I can ask good questions and make careful use of data, but I need rigorous training in forecasting and optimization, and peers who will challenge how I reason. I have already shown I can study seriously alongside full-time work, earning CPIM and PMP certifications.</w:t>
-      </w:r>
-    </w:p>
-    <w:p>
-      <w:pPr>
-        <w:pStyle w:val="BodyText"/>
-      </w:pPr>
-      <w:r>
-        <w:t xml:space="preserve">At Cornell, I would bring the habits these experiences built: asking the basic question when others hesitate, listening before judging, and making room for classmates whose training or background differs from mine. I have learned that the best work happens in teams where no one is afraid to say what they do not yet understand, and I want to help create that environment.</w:t>
+        <w:t xml:space="preserve">At Cornell, I would bring the translator’s habits to a cohort of people with varied training, cultures, and strengths: explaining ideas in terms a classmate can use, asking the basic question when others hesitate, and listening before judging. I expect to share what I know about airline and logistics operations and to learn from classmates in finance and marketing. I want every teammate to feel their perspective is needed, because the best decisions come from people who can understand one another.</w:t>
       </w:r>
     </w:p>
     <w:bookmarkEnd w:id="21"/>

</xml_diff>

<commit_message>
Open Cornell personal statement with GSO cross-team meeting scene; use resume details
Co-Authored-By: Claude Sonnet 5.5 <noreply@anthropic.com>
Claude-Session: https://claude.ai/code/session_016jK7nG2piZZaD8aY8Qq4ov
</commit_message>
<xml_diff>
--- a/Cornell_MSBA/Cornell_MSBA_SOP_and_PS.docx
+++ b/Cornell_MSBA/Cornell_MSBA_SOP_and_PS.docx
@@ -83,7 +83,7 @@
         <w:pStyle w:val="FirstParagraph"/>
       </w:pPr>
       <w:r>
-        <w:t xml:space="preserve">After thirteen years of work, what pushed me toward graduate study was not a lack of experience but the limits of what experience alone could teach me. I could build tools and run analyses, yet I kept reaching questions I could not answer well: why one method suits a problem, how far to trust a forecast, what evidence justifies a decision. I realized that I needed two things I could not get on the job: the theory behind the methods I use, and fresh conversations with peers who do not share my assumptions.</w:t>
+        <w:t xml:space="preserve">In an internal meeting during the Group Sales Optimizer (GSO) project at Korean Air, the sales, revenue management, and IT teams sat at the same table. The IT team began describing a system process that no one else in the room could follow, and the conversation stalled. I restated the process in plain terms tied to how group bookings actually work. Sales and revenue management colleagues began asking questions, and the IT engineers, who had been talking past everyone, began answering them directly. Nothing about the system had changed; the people in the room could simply now take part.</w:t>
       </w:r>
     </w:p>
     <w:p>
@@ -91,7 +91,7 @@
         <w:pStyle w:val="BodyText"/>
       </w:pPr>
       <w:r>
-        <w:t xml:space="preserve">The role that taught me the most about working across differences was the 17-month Group Sales Optimizer project at Korean Air, where I translated sales rules into automated booking workflows. The people involved spoke different professional languages. Sales staff knew pricing and customers but little about systems, IT engineers knew systems but not how group sales works, and external vendors had their own constraints and vocabulary. I became the translator. For sales colleagues, I described requirements in terms of customers and revenue. For engineers, I expressed the same needs as precise logic and data. For vendors, I framed requests in terms of their situation and terminology. No one needed to learn another’s field; they needed someone willing to meet them where they were. The project worked because everyone could take part on terms they understood.</w:t>
+        <w:t xml:space="preserve">That role, translator and communicator, defined my 17 months managing GSO. The project required coordinating Korean Air sales and IT, our U.S. vendor PROS, and Japan Airlines and ANA as reference partners across time zones and languages. For sales colleagues, I described requirements in terms of customers and revenue. For engineers, I expressed the same needs as precise logic and data. For partners, I framed requests in terms of their own systems and vocabulary, using English and Japanese as needed. I came to believe that good teams do not require everyone to think alike; they require someone willing to meet each person where they are.</w:t>
       </w:r>
     </w:p>
     <w:p>
@@ -99,7 +99,7 @@
         <w:pStyle w:val="BodyText"/>
       </w:pPr>
       <w:r>
-        <w:t xml:space="preserve">I learned the same lesson leading a team of seven in Manila, Cebu, and Guam, where headquarters and local agencies read the market differently. Field visits showed me that local colleagues held knowledge that our reports lacked, and revising our reporting so their voices reached decisions helped group reservations rise 340% year over year. When I joined Samsung SDS in 2024, I became the newcomer, asking questions that once felt too basic. That openness helped a six-person task force settle a reporting dispute across ten organizations by first agreeing on what each rule was meant to measure.</w:t>
+        <w:t xml:space="preserve">It was also in this role that I recognized the limits of what experience could teach me. I could bridge teams and build tools, yet I kept reaching questions I could not answer rigorously: why one method suits a problem, how far to trust a forecast, what evidence justifies a decision. After thirteen years of work, I need two things I cannot get on the job: the theory behind the methods I use, and fresh conversations with peers who do not share my assumptions. That is why I am pursuing a graduate degree now.</w:t>
       </w:r>
     </w:p>
     <w:p>
@@ -107,7 +107,7 @@
         <w:pStyle w:val="BodyText"/>
       </w:pPr>
       <w:r>
-        <w:t xml:space="preserve">I have also shown I can sustain demanding study. I earned CPIM and PMP certifications while working full time, and, as a parent, I taught myself production and fulfillment to build a product, AiMollaeBook, now past 2,000 units.</w:t>
+        <w:t xml:space="preserve">I am prepared for its demands. I earned CPIM and PMP certifications while working full time. As a parent, I taught myself production and fulfillment to build a product, AiMollaeBook, now past 2,000 units. Earlier, leading a team of seven in Manila, Cebu, and Guam, I learned that local colleagues held knowledge that headquarters’ reports lacked, and revising our reporting so their voices reached decisions helped group reservations rise 340% year over year. When I joined Samsung SDS in 2024, I became the newcomer, and asking basic questions helped a six-person task force settle a reporting dispute across ten organizations.</w:t>
       </w:r>
     </w:p>
     <w:p>
@@ -115,7 +115,7 @@
         <w:pStyle w:val="BodyText"/>
       </w:pPr>
       <w:r>
-        <w:t xml:space="preserve">At Cornell, I would bring the translator’s habits to a cohort of people with varied training, cultures, and strengths: explaining ideas in terms a classmate can use, asking the basic question when others hesitate, and listening before judging. I expect to share what I know about airline and logistics operations and to learn from classmates in finance and marketing. I want every teammate to feel their perspective is needed, because the best decisions come from people who can understand one another.</w:t>
+        <w:t xml:space="preserve">At Cornell, I would bring the translator’s habits to a cohort of people with different training, cultures, and strengths: explaining ideas in terms a classmate can use, asking the basic question when others hesitate, and listening before judging. I would share what I know about airline and logistics operations and learn from classmates in finance and marketing. I want every teammate to feel their perspective is needed, because the best decisions come from people who can understand one another.</w:t>
       </w:r>
     </w:p>
     <w:bookmarkEnd w:id="21"/>

</xml_diff>

<commit_message>
Add reflective opening paragraph to Cornell personal statement
Co-Authored-By: Claude Sonnet 5.5 <noreply@anthropic.com>
Claude-Session: https://claude.ai/code/session_016jK7nG2piZZaD8aY8Qq4ov
</commit_message>
<xml_diff>
--- a/Cornell_MSBA/Cornell_MSBA_SOP_and_PS.docx
+++ b/Cornell_MSBA/Cornell_MSBA_SOP_and_PS.docx
@@ -83,7 +83,7 @@
         <w:pStyle w:val="FirstParagraph"/>
       </w:pPr>
       <w:r>
-        <w:t xml:space="preserve">In an internal meeting during the Group Sales Optimizer (GSO) project at Korean Air, the sales, revenue management, and IT teams sat at the same table. The IT team began describing a system process that no one else in the room could follow, and the conversation stalled. I restated the process in plain terms tied to how group bookings actually work. Sales and revenue management colleagues began asking questions, and the IT engineers, who had been talking past everyone, began answering them directly. Nothing about the system had changed; the people in the room could simply now take part.</w:t>
+        <w:t xml:space="preserve">I have always been most useful in the space between people who know different things. I feel most at home when I can make what one person knows usable to someone else, and that, more than any single technical skill, is what I enjoy about my work.</w:t>
       </w:r>
     </w:p>
     <w:p>
@@ -91,7 +91,7 @@
         <w:pStyle w:val="BodyText"/>
       </w:pPr>
       <w:r>
-        <w:t xml:space="preserve">That role, translator and communicator, defined my 17 months managing GSO. The project required coordinating Korean Air sales and IT, our U.S. vendor PROS, and Japan Airlines and ANA as reference partners across time zones and languages. For sales colleagues, I described requirements in terms of customers and revenue. For engineers, I expressed the same needs as precise logic and data. For partners, I framed requests in terms of their own systems and vocabulary, using English and Japanese as needed. I came to believe that good teams do not require everyone to think alike; they require someone willing to meet each person where they are.</w:t>
+        <w:t xml:space="preserve">I saw it most clearly in a meeting during the Group Sales Optimizer (GSO) project at Korean Air, where the sales, revenue management, and IT teams sat at the same table. The IT team began describing a system process that no one else in the room could follow, and the conversation stalled. I restated the process in plain terms tied to how group bookings actually work. Sales and revenue management colleagues began asking questions, and the IT engineers, who had been talking past everyone, began answering them directly.</w:t>
       </w:r>
     </w:p>
     <w:p>
@@ -99,7 +99,7 @@
         <w:pStyle w:val="BodyText"/>
       </w:pPr>
       <w:r>
-        <w:t xml:space="preserve">It was also in this role that I recognized the limits of what experience could teach me. I could bridge teams and build tools, yet I kept reaching questions I could not answer rigorously: why one method suits a problem, how far to trust a forecast, what evidence justifies a decision. After thirteen years of work, I need two things I cannot get on the job: the theory behind the methods I use, and fresh conversations with peers who do not share my assumptions. That is why I am pursuing a graduate degree now.</w:t>
+        <w:t xml:space="preserve">That translator role defined my 17 months managing GSO, which required coordinating Korean Air sales and IT, our U.S. vendor PROS, and Japan Airlines and ANA as reference partners across time zones and languages. For sales colleagues, I described requirements in terms of customers and revenue. For engineers, I expressed the same needs as precise logic and data. For partners, I framed requests in terms of their own systems and vocabulary, using English and Japanese as needed. Good teams do not require everyone to think alike; they require someone willing to meet each person where they are.</w:t>
       </w:r>
     </w:p>
     <w:p>
@@ -107,7 +107,7 @@
         <w:pStyle w:val="BodyText"/>
       </w:pPr>
       <w:r>
-        <w:t xml:space="preserve">I am prepared for its demands. I earned CPIM and PMP certifications while working full time. As a parent, I taught myself production and fulfillment to build a product, AiMollaeBook, now past 2,000 units. Earlier, leading a team of seven in Manila, Cebu, and Guam, I learned that local colleagues held knowledge that headquarters’ reports lacked, and revising our reporting so their voices reached decisions helped group reservations rise 340% year over year. When I joined Samsung SDS in 2024, I became the newcomer, and asking basic questions helped a six-person task force settle a reporting dispute across ten organizations.</w:t>
+        <w:t xml:space="preserve">It was also here that I recognized the limits of experience. I could bridge teams and build tools, yet I kept reaching questions I could not answer rigorously: why one method suits a problem, how far to trust a forecast, what evidence justifies a decision. After thirteen years of work, I need two things I cannot get on the job: the theory behind the methods I use, and fresh conversations with peers who do not share my assumptions. That is why I am pursuing a graduate degree now.</w:t>
       </w:r>
     </w:p>
     <w:p>
@@ -115,7 +115,15 @@
         <w:pStyle w:val="BodyText"/>
       </w:pPr>
       <w:r>
-        <w:t xml:space="preserve">At Cornell, I would bring the translator’s habits to a cohort of people with different training, cultures, and strengths: explaining ideas in terms a classmate can use, asking the basic question when others hesitate, and listening before judging. I would share what I know about airline and logistics operations and learn from classmates in finance and marketing. I want every teammate to feel their perspective is needed, because the best decisions come from people who can understand one another.</w:t>
+        <w:t xml:space="preserve">I am prepared for its demands. I earned CPIM and PMP certifications while working full time. As a parent, I taught myself production and fulfillment to build a product, AiMollaeBook, now past 2,000 units. Leading a team of seven in Manila, Cebu, and Guam, I learned that local colleagues held knowledge headquarters’ reports lacked, and revising our reporting to carry their voices helped group reservations rise 340% year over year. At Samsung SDS, being the newcomer and asking basic questions helped a six-person task force settle a reporting dispute across ten organizations.</w:t>
+      </w:r>
+    </w:p>
+    <w:p>
+      <w:pPr>
+        <w:pStyle w:val="BodyText"/>
+      </w:pPr>
+      <w:r>
+        <w:t xml:space="preserve">At Cornell, I would bring the translator’s habits to a cohort of people with different training, cultures, and strengths: explaining ideas in terms a classmate can use, asking the basic question when others hesitate, and listening before judging. I want every teammate to feel their perspective is needed, because the best decisions come from people who can understand one another.</w:t>
       </w:r>
     </w:p>
     <w:bookmarkEnd w:id="21"/>

</xml_diff>